<commit_message>
Align the tolerance figure and drop one stale phrase
- the comparison table still cited 8.3e-7 m while the answer document and the
  structure note had moved to the re-measured 6.0e-7 m; unified on 6.0e-7,
  which is what the exact global candidate set actually produced
- "备选方案（如认为按索引择一过于武断）" described a rule that is no longer the
  main one - the last level sorts by vertex coordinates now, not by index -
  so the alternative is framed by what it actually offers: symmetry

Co-Authored-By: Claude Fable 5 <noreply@anthropic.com>
</commit_message>
<xml_diff>
--- a/交付_20260731_合作方权利要求答复/02_修订版权利要求/权利要求1-2_修订版_20260731.docx
+++ b/交付_20260731_合作方权利要求答复/02_修订版权利要求/权利要求1-2_修订版_20260731.docx
@@ -2252,11 +2252,11 @@
             </w:r>
             <w:r>
               <w:rPr/>
-              <w:t xml:space="preserve">的逻辑跳跃；容差是因为浮点实现下理论等距点会出现末位差异——真实数据实测该差异达 </w:t>
-            </w:r>
-            <w:r>
-              <w:rPr/>
-              <w:t>8.3×10⁻⁷ m</w:t>
+              <w:t xml:space="preserve">的逻辑跳跃；容差是因为浮点实现下理论等距点会出现末位差异——真实数据实测该差异约 </w:t>
+            </w:r>
+            <w:r>
+              <w:rPr/>
+              <w:t>6.0×10⁻⁷ m</w:t>
             </w:r>
             <w:r>
               <w:rPr/>

</xml_diff>